<commit_message>
Final changes before production release
</commit_message>
<xml_diff>
--- a/Mobile App Project Write-up.docx
+++ b/Mobile App Project Write-up.docx
@@ -1432,10 +1432,10 @@
                 <w:noProof/>
               </w:rPr>
               <w:drawing>
-                <wp:inline distT="0" distB="0" distL="0" distR="0" wp14:anchorId="6564EF45" wp14:editId="561F951A">
-                  <wp:extent cx="6188710" cy="3990975"/>
-                  <wp:effectExtent l="0" t="0" r="2540" b="9525"/>
-                  <wp:docPr id="174931307" name="Picture 1"/>
+                <wp:inline distT="0" distB="0" distL="0" distR="0" wp14:anchorId="30291146" wp14:editId="102EB311">
+                  <wp:extent cx="6188710" cy="3994785"/>
+                  <wp:effectExtent l="0" t="0" r="2540" b="5715"/>
+                  <wp:docPr id="549980676" name="Picture 1"/>
                   <wp:cNvGraphicFramePr>
                     <a:graphicFrameLocks xmlns:a="http://schemas.openxmlformats.org/drawingml/2006/main" noChangeAspect="1"/>
                   </wp:cNvGraphicFramePr>
@@ -1443,7 +1443,7 @@
                     <a:graphicData uri="http://schemas.openxmlformats.org/drawingml/2006/picture">
                       <pic:pic xmlns:pic="http://schemas.openxmlformats.org/drawingml/2006/picture">
                         <pic:nvPicPr>
-                          <pic:cNvPr id="174931307" name="Picture 174931307"/>
+                          <pic:cNvPr id="549980676" name="Picture 549980676"/>
                           <pic:cNvPicPr/>
                         </pic:nvPicPr>
                         <pic:blipFill>
@@ -1461,7 +1461,7 @@
                         <pic:spPr>
                           <a:xfrm>
                             <a:off x="0" y="0"/>
-                            <a:ext cx="6188710" cy="3990975"/>
+                            <a:ext cx="6188710" cy="3994785"/>
                           </a:xfrm>
                           <a:prstGeom prst="rect">
                             <a:avLst/>
@@ -1691,6 +1691,9 @@
         </w:tc>
       </w:tr>
       <w:tr>
+        <w:trPr>
+          <w:trHeight w:val="283"/>
+        </w:trPr>
         <w:tc>
           <w:tcPr>
             <w:tcW w:w="9780" w:type="dxa"/>
@@ -1724,6 +1727,9 @@
         </w:tc>
       </w:tr>
       <w:tr>
+        <w:trPr>
+          <w:trHeight w:val="283"/>
+        </w:trPr>
         <w:tc>
           <w:tcPr>
             <w:tcW w:w="2126" w:type="dxa"/>
@@ -1794,6 +1800,9 @@
         </w:tc>
       </w:tr>
       <w:tr>
+        <w:trPr>
+          <w:trHeight w:val="283"/>
+        </w:trPr>
         <w:tc>
           <w:tcPr>
             <w:tcW w:w="9780" w:type="dxa"/>
@@ -1827,6 +1836,9 @@
         </w:tc>
       </w:tr>
       <w:tr>
+        <w:trPr>
+          <w:trHeight w:val="283"/>
+        </w:trPr>
         <w:tc>
           <w:tcPr>
             <w:tcW w:w="2126" w:type="dxa"/>
@@ -1897,6 +1909,9 @@
         </w:tc>
       </w:tr>
       <w:tr>
+        <w:trPr>
+          <w:trHeight w:val="283"/>
+        </w:trPr>
         <w:tc>
           <w:tcPr>
             <w:tcW w:w="9780" w:type="dxa"/>
@@ -1930,6 +1945,9 @@
         </w:tc>
       </w:tr>
       <w:tr>
+        <w:trPr>
+          <w:trHeight w:val="283"/>
+        </w:trPr>
         <w:tc>
           <w:tcPr>
             <w:tcW w:w="2126" w:type="dxa"/>
@@ -2000,6 +2018,9 @@
         </w:tc>
       </w:tr>
       <w:tr>
+        <w:trPr>
+          <w:trHeight w:val="283"/>
+        </w:trPr>
         <w:tc>
           <w:tcPr>
             <w:tcW w:w="9780" w:type="dxa"/>
@@ -2033,6 +2054,9 @@
         </w:tc>
       </w:tr>
       <w:tr>
+        <w:trPr>
+          <w:trHeight w:val="283"/>
+        </w:trPr>
         <w:tc>
           <w:tcPr>
             <w:tcW w:w="2126" w:type="dxa"/>
@@ -2119,6 +2143,9 @@
         </w:tc>
       </w:tr>
       <w:tr>
+        <w:trPr>
+          <w:trHeight w:val="283"/>
+        </w:trPr>
         <w:tc>
           <w:tcPr>
             <w:tcW w:w="9780" w:type="dxa"/>
@@ -2152,6 +2179,9 @@
         </w:tc>
       </w:tr>
       <w:tr>
+        <w:trPr>
+          <w:trHeight w:val="283"/>
+        </w:trPr>
         <w:tc>
           <w:tcPr>
             <w:tcW w:w="2126" w:type="dxa"/>
@@ -2222,6 +2252,9 @@
         </w:tc>
       </w:tr>
       <w:tr>
+        <w:trPr>
+          <w:trHeight w:val="283"/>
+        </w:trPr>
         <w:tc>
           <w:tcPr>
             <w:tcW w:w="2126" w:type="dxa"/>
@@ -2306,6 +2339,9 @@
         </w:tc>
       </w:tr>
       <w:tr>
+        <w:trPr>
+          <w:trHeight w:val="283"/>
+        </w:trPr>
         <w:tc>
           <w:tcPr>
             <w:tcW w:w="9780" w:type="dxa"/>
@@ -2339,6 +2375,9 @@
         </w:tc>
       </w:tr>
       <w:tr>
+        <w:trPr>
+          <w:trHeight w:val="283"/>
+        </w:trPr>
         <w:tc>
           <w:tcPr>
             <w:tcW w:w="2126" w:type="dxa"/>
@@ -2409,6 +2448,9 @@
         </w:tc>
       </w:tr>
       <w:tr>
+        <w:trPr>
+          <w:trHeight w:val="283"/>
+        </w:trPr>
         <w:tc>
           <w:tcPr>
             <w:tcW w:w="2126" w:type="dxa"/>
@@ -2478,6 +2520,9 @@
         </w:tc>
       </w:tr>
       <w:tr>
+        <w:trPr>
+          <w:trHeight w:val="283"/>
+        </w:trPr>
         <w:tc>
           <w:tcPr>
             <w:tcW w:w="9780" w:type="dxa"/>
@@ -2511,6 +2556,9 @@
         </w:tc>
       </w:tr>
       <w:tr>
+        <w:trPr>
+          <w:trHeight w:val="283"/>
+        </w:trPr>
         <w:tc>
           <w:tcPr>
             <w:tcW w:w="2126" w:type="dxa"/>
@@ -2576,6 +2624,78 @@
                 <w:szCs w:val="20"/>
               </w:rPr>
               <w:t>Sends emails from the contact form</w:t>
+            </w:r>
+          </w:p>
+        </w:tc>
+      </w:tr>
+      <w:tr>
+        <w:trPr>
+          <w:trHeight w:val="283"/>
+        </w:trPr>
+        <w:tc>
+          <w:tcPr>
+            <w:tcW w:w="2126" w:type="dxa"/>
+            <w:tcBorders>
+              <w:top w:val="single" w:sz="1" w:space="0" w:color="D0CBC0"/>
+              <w:left w:val="single" w:sz="1" w:space="0" w:color="D0CBC0"/>
+              <w:bottom w:val="single" w:sz="1" w:space="0" w:color="D0CBC0"/>
+              <w:right w:val="single" w:sz="1" w:space="0" w:color="D0CBC0"/>
+            </w:tcBorders>
+            <w:shd w:val="clear" w:color="auto" w:fill="FFFFFF"/>
+            <w:tcMar>
+              <w:top w:w="80" w:type="dxa"/>
+              <w:left w:w="120" w:type="dxa"/>
+              <w:bottom w:w="80" w:type="dxa"/>
+              <w:right w:w="80" w:type="dxa"/>
+            </w:tcMar>
+          </w:tcPr>
+          <w:p>
+            <w:pPr>
+              <w:rPr>
+                <w:sz w:val="20"/>
+                <w:szCs w:val="20"/>
+              </w:rPr>
+            </w:pPr>
+            <w:r>
+              <w:rPr>
+                <w:sz w:val="20"/>
+                <w:szCs w:val="20"/>
+              </w:rPr>
+              <w:t>SES</w:t>
+            </w:r>
+          </w:p>
+        </w:tc>
+        <w:tc>
+          <w:tcPr>
+            <w:tcW w:w="7654" w:type="dxa"/>
+            <w:gridSpan w:val="2"/>
+            <w:tcBorders>
+              <w:top w:val="single" w:sz="1" w:space="0" w:color="D0CBC0"/>
+              <w:left w:val="single" w:sz="1" w:space="0" w:color="D0CBC0"/>
+              <w:bottom w:val="single" w:sz="1" w:space="0" w:color="D0CBC0"/>
+              <w:right w:val="single" w:sz="1" w:space="0" w:color="D0CBC0"/>
+            </w:tcBorders>
+            <w:shd w:val="clear" w:color="auto" w:fill="FFFFFF"/>
+            <w:tcMar>
+              <w:top w:w="80" w:type="dxa"/>
+              <w:left w:w="120" w:type="dxa"/>
+              <w:bottom w:w="80" w:type="dxa"/>
+              <w:right w:w="80" w:type="dxa"/>
+            </w:tcMar>
+          </w:tcPr>
+          <w:p>
+            <w:pPr>
+              <w:rPr>
+                <w:sz w:val="20"/>
+                <w:szCs w:val="20"/>
+              </w:rPr>
+            </w:pPr>
+            <w:r>
+              <w:rPr>
+                <w:sz w:val="20"/>
+                <w:szCs w:val="20"/>
+              </w:rPr>
+              <w:t>Used by Cognito to send a verification email to users during sign-up process</w:t>
             </w:r>
           </w:p>
         </w:tc>
@@ -3023,21 +3143,7 @@
           <w:sz w:val="20"/>
           <w:szCs w:val="20"/>
         </w:rPr>
-        <w:t xml:space="preserve">p 2: Click </w:t>
-      </w:r>
-      <w:r>
-        <w:rPr>
-          <w:sz w:val="20"/>
-          <w:szCs w:val="20"/>
-        </w:rPr>
-        <w:t>Sign In</w:t>
-      </w:r>
-      <w:r>
-        <w:rPr>
-          <w:sz w:val="20"/>
-          <w:szCs w:val="20"/>
-        </w:rPr>
-        <w:t>.</w:t>
+        <w:t>p 2: Click Sign In.</w:t>
       </w:r>
     </w:p>
     <w:p>
@@ -3093,21 +3199,6 @@
     </w:p>
     <w:p>
       <w:pPr>
-        <w:spacing w:before="20" w:after="80"/>
-      </w:pPr>
-    </w:p>
-    <w:p>
-      <w:pPr>
-        <w:spacing w:before="20" w:after="80"/>
-      </w:pPr>
-    </w:p>
-    <w:p>
-      <w:pPr>
-        <w:spacing w:before="20" w:after="80"/>
-      </w:pPr>
-    </w:p>
-    <w:p>
-      <w:pPr>
         <w:spacing w:after="120"/>
       </w:pPr>
       <w:r>
@@ -3207,7 +3298,14 @@
           <w:sz w:val="20"/>
           <w:szCs w:val="20"/>
         </w:rPr>
-        <w:t>Step 3: Change the “To Currency” into GBP – British Pounds.</w:t>
+        <w:t>Step 3: Change the “To Currency” into GBP – British Pounds</w:t>
+      </w:r>
+      <w:r>
+        <w:rPr>
+          <w:sz w:val="20"/>
+          <w:szCs w:val="20"/>
+        </w:rPr>
+        <w:t xml:space="preserve"> (should be the default).</w:t>
       </w:r>
     </w:p>
     <w:p>
@@ -3795,114 +3893,6 @@
               <w:bottom w:val="single" w:sz="1" w:space="0" w:color="D0CBC0"/>
               <w:right w:val="single" w:sz="1" w:space="0" w:color="D0CBC0"/>
             </w:tcBorders>
-            <w:shd w:val="clear" w:color="auto" w:fill="F5F0E8"/>
-            <w:tcMar>
-              <w:top w:w="80" w:type="dxa"/>
-              <w:left w:w="120" w:type="dxa"/>
-              <w:bottom w:w="80" w:type="dxa"/>
-              <w:right w:w="80" w:type="dxa"/>
-            </w:tcMar>
-          </w:tcPr>
-          <w:p>
-            <w:pPr>
-              <w:rPr>
-                <w:sz w:val="20"/>
-                <w:szCs w:val="20"/>
-              </w:rPr>
-            </w:pPr>
-            <w:r>
-              <w:rPr>
-                <w:sz w:val="20"/>
-                <w:szCs w:val="20"/>
-              </w:rPr>
-              <w:t>Private S3 bucket</w:t>
-            </w:r>
-          </w:p>
-        </w:tc>
-        <w:tc>
-          <w:tcPr>
-            <w:tcW w:w="4400" w:type="dxa"/>
-            <w:tcBorders>
-              <w:top w:val="single" w:sz="1" w:space="0" w:color="D0CBC0"/>
-              <w:left w:val="single" w:sz="1" w:space="0" w:color="D0CBC0"/>
-              <w:bottom w:val="single" w:sz="1" w:space="0" w:color="D0CBC0"/>
-              <w:right w:val="single" w:sz="1" w:space="0" w:color="D0CBC0"/>
-            </w:tcBorders>
-            <w:shd w:val="clear" w:color="auto" w:fill="F5F0E8"/>
-            <w:tcMar>
-              <w:top w:w="80" w:type="dxa"/>
-              <w:left w:w="120" w:type="dxa"/>
-              <w:bottom w:w="80" w:type="dxa"/>
-              <w:right w:w="80" w:type="dxa"/>
-            </w:tcMar>
-          </w:tcPr>
-          <w:p>
-            <w:pPr>
-              <w:rPr>
-                <w:sz w:val="20"/>
-                <w:szCs w:val="20"/>
-              </w:rPr>
-            </w:pPr>
-            <w:r>
-              <w:rPr>
-                <w:sz w:val="20"/>
-                <w:szCs w:val="20"/>
-              </w:rPr>
-              <w:t>Block All Public Access enabled</w:t>
-            </w:r>
-            <w:r>
-              <w:rPr>
-                <w:sz w:val="20"/>
-                <w:szCs w:val="20"/>
-              </w:rPr>
-              <w:t>.</w:t>
-            </w:r>
-          </w:p>
-        </w:tc>
-        <w:tc>
-          <w:tcPr>
-            <w:tcW w:w="2980" w:type="dxa"/>
-            <w:tcBorders>
-              <w:top w:val="single" w:sz="1" w:space="0" w:color="D0CBC0"/>
-              <w:left w:val="single" w:sz="1" w:space="0" w:color="D0CBC0"/>
-              <w:bottom w:val="single" w:sz="1" w:space="0" w:color="D0CBC0"/>
-              <w:right w:val="single" w:sz="1" w:space="0" w:color="D0CBC0"/>
-            </w:tcBorders>
-            <w:shd w:val="clear" w:color="auto" w:fill="F5F0E8"/>
-            <w:tcMar>
-              <w:top w:w="80" w:type="dxa"/>
-              <w:left w:w="120" w:type="dxa"/>
-              <w:bottom w:w="80" w:type="dxa"/>
-              <w:right w:w="80" w:type="dxa"/>
-            </w:tcMar>
-          </w:tcPr>
-          <w:p>
-            <w:pPr>
-              <w:rPr>
-                <w:sz w:val="20"/>
-                <w:szCs w:val="20"/>
-              </w:rPr>
-            </w:pPr>
-            <w:r>
-              <w:rPr>
-                <w:sz w:val="20"/>
-                <w:szCs w:val="20"/>
-              </w:rPr>
-              <w:t>Implemented</w:t>
-            </w:r>
-          </w:p>
-        </w:tc>
-      </w:tr>
-      <w:tr>
-        <w:tc>
-          <w:tcPr>
-            <w:tcW w:w="2400" w:type="dxa"/>
-            <w:tcBorders>
-              <w:top w:val="single" w:sz="1" w:space="0" w:color="D0CBC0"/>
-              <w:left w:val="single" w:sz="1" w:space="0" w:color="D0CBC0"/>
-              <w:bottom w:val="single" w:sz="1" w:space="0" w:color="D0CBC0"/>
-              <w:right w:val="single" w:sz="1" w:space="0" w:color="D0CBC0"/>
-            </w:tcBorders>
             <w:shd w:val="clear" w:color="auto" w:fill="FFFFFF"/>
             <w:tcMar>
               <w:top w:w="80" w:type="dxa"/>
@@ -4335,6 +4325,8 @@
         </w:tc>
       </w:tr>
     </w:tbl>
+    <w:p/>
+    <w:p/>
     <w:p/>
     <w:tbl>
       <w:tblPr>
@@ -5443,6 +5435,140 @@
                 <w:szCs w:val="20"/>
               </w:rPr>
               <w:t>0 (used to store templates)</w:t>
+            </w:r>
+          </w:p>
+        </w:tc>
+        <w:tc>
+          <w:tcPr>
+            <w:tcW w:w="1842" w:type="dxa"/>
+            <w:tcBorders>
+              <w:top w:val="single" w:sz="1" w:space="0" w:color="D0CBC0"/>
+              <w:left w:val="single" w:sz="1" w:space="0" w:color="D0CBC0"/>
+              <w:bottom w:val="single" w:sz="1" w:space="0" w:color="D0CBC0"/>
+              <w:right w:val="single" w:sz="1" w:space="0" w:color="D0CBC0"/>
+            </w:tcBorders>
+            <w:shd w:val="clear" w:color="auto" w:fill="FFFFFF" w:themeFill="background1"/>
+            <w:tcMar>
+              <w:top w:w="80" w:type="dxa"/>
+              <w:left w:w="120" w:type="dxa"/>
+              <w:bottom w:w="80" w:type="dxa"/>
+              <w:right w:w="80" w:type="dxa"/>
+            </w:tcMar>
+          </w:tcPr>
+          <w:p>
+            <w:pPr>
+              <w:rPr>
+                <w:sz w:val="20"/>
+                <w:szCs w:val="20"/>
+              </w:rPr>
+            </w:pPr>
+            <w:r>
+              <w:rPr>
+                <w:sz w:val="20"/>
+                <w:szCs w:val="20"/>
+              </w:rPr>
+              <w:t>£0.00</w:t>
+            </w:r>
+          </w:p>
+        </w:tc>
+        <w:tc>
+          <w:tcPr>
+            <w:tcW w:w="2410" w:type="dxa"/>
+            <w:tcBorders>
+              <w:top w:val="single" w:sz="1" w:space="0" w:color="D0CBC0"/>
+              <w:left w:val="single" w:sz="1" w:space="0" w:color="D0CBC0"/>
+              <w:bottom w:val="single" w:sz="1" w:space="0" w:color="D0CBC0"/>
+              <w:right w:val="single" w:sz="1" w:space="0" w:color="D0CBC0"/>
+            </w:tcBorders>
+            <w:shd w:val="clear" w:color="auto" w:fill="FFFFFF" w:themeFill="background1"/>
+            <w:tcMar>
+              <w:top w:w="80" w:type="dxa"/>
+              <w:left w:w="120" w:type="dxa"/>
+              <w:bottom w:w="80" w:type="dxa"/>
+              <w:right w:w="80" w:type="dxa"/>
+            </w:tcMar>
+          </w:tcPr>
+          <w:p>
+            <w:pPr>
+              <w:rPr>
+                <w:sz w:val="20"/>
+                <w:szCs w:val="20"/>
+              </w:rPr>
+            </w:pPr>
+            <w:r>
+              <w:rPr>
+                <w:sz w:val="20"/>
+                <w:szCs w:val="20"/>
+              </w:rPr>
+              <w:t>£0.00</w:t>
+            </w:r>
+          </w:p>
+        </w:tc>
+      </w:tr>
+      <w:tr>
+        <w:tc>
+          <w:tcPr>
+            <w:tcW w:w="2551" w:type="dxa"/>
+            <w:tcBorders>
+              <w:top w:val="single" w:sz="1" w:space="0" w:color="D0CBC0"/>
+              <w:left w:val="single" w:sz="1" w:space="0" w:color="D0CBC0"/>
+              <w:bottom w:val="single" w:sz="1" w:space="0" w:color="D0CBC0"/>
+              <w:right w:val="single" w:sz="1" w:space="0" w:color="D0CBC0"/>
+            </w:tcBorders>
+            <w:shd w:val="clear" w:color="auto" w:fill="FFFFFF" w:themeFill="background1"/>
+            <w:tcMar>
+              <w:top w:w="80" w:type="dxa"/>
+              <w:left w:w="120" w:type="dxa"/>
+              <w:bottom w:w="80" w:type="dxa"/>
+              <w:right w:w="80" w:type="dxa"/>
+            </w:tcMar>
+          </w:tcPr>
+          <w:p>
+            <w:pPr>
+              <w:rPr>
+                <w:sz w:val="20"/>
+                <w:szCs w:val="20"/>
+              </w:rPr>
+            </w:pPr>
+            <w:r>
+              <w:rPr>
+                <w:sz w:val="20"/>
+                <w:szCs w:val="20"/>
+              </w:rPr>
+              <w:t>SES</w:t>
+            </w:r>
+          </w:p>
+        </w:tc>
+        <w:tc>
+          <w:tcPr>
+            <w:tcW w:w="2977" w:type="dxa"/>
+            <w:tcBorders>
+              <w:top w:val="single" w:sz="1" w:space="0" w:color="D0CBC0"/>
+              <w:left w:val="single" w:sz="1" w:space="0" w:color="D0CBC0"/>
+              <w:bottom w:val="single" w:sz="1" w:space="0" w:color="D0CBC0"/>
+              <w:right w:val="single" w:sz="1" w:space="0" w:color="D0CBC0"/>
+            </w:tcBorders>
+            <w:shd w:val="clear" w:color="auto" w:fill="FFFFFF" w:themeFill="background1"/>
+            <w:tcMar>
+              <w:top w:w="80" w:type="dxa"/>
+              <w:left w:w="120" w:type="dxa"/>
+              <w:bottom w:w="80" w:type="dxa"/>
+              <w:right w:w="80" w:type="dxa"/>
+            </w:tcMar>
+          </w:tcPr>
+          <w:p>
+            <w:pPr>
+              <w:rPr>
+                <w:sz w:val="20"/>
+                <w:szCs w:val="20"/>
+              </w:rPr>
+            </w:pPr>
+            <w:r>
+              <w:rPr>
+                <w:sz w:val="20"/>
+                <w:szCs w:val="20"/>
+              </w:rPr>
+              <w:t>15 emails per month</w:t>
             </w:r>
           </w:p>
         </w:tc>
@@ -7159,15 +7285,6 @@
 </file>
 
 <file path=customXml/item1.xml><?xml version="1.0" encoding="utf-8"?>
-<?mso-contentType ?>
-<FormTemplates xmlns="http://schemas.microsoft.com/sharepoint/v3/contenttype/forms">
-  <Display>DocumentLibraryForm</Display>
-  <Edit>DocumentLibraryForm</Edit>
-  <New>DocumentLibraryForm</New>
-</FormTemplates>
-</file>
-
-<file path=customXml/item2.xml><?xml version="1.0" encoding="utf-8"?>
 <p:properties xmlns:p="http://schemas.microsoft.com/office/2006/metadata/properties" xmlns:xsi="http://www.w3.org/2001/XMLSchema-instance" xmlns:pc="http://schemas.microsoft.com/office/infopath/2007/PartnerControls">
   <documentManagement>
     <TaxCatchAll xmlns="1f02373c-91b9-4d50-88b3-64e98dbf38be" xsi:nil="true"/>
@@ -7178,7 +7295,7 @@
 </p:properties>
 </file>
 
-<file path=customXml/item3.xml><?xml version="1.0" encoding="utf-8"?>
+<file path=customXml/item2.xml><?xml version="1.0" encoding="utf-8"?>
 <ct:contentTypeSchema xmlns:ct="http://schemas.microsoft.com/office/2006/metadata/contentType" xmlns:ma="http://schemas.microsoft.com/office/2006/metadata/properties/metaAttributes" ct:_="" ma:_="" ma:contentTypeName="Document" ma:contentTypeID="0x010100A81AF59A993C62428A8621167C157F34" ma:contentTypeVersion="13" ma:contentTypeDescription="Create a new document." ma:contentTypeScope="" ma:versionID="075165b7e1cb8af8b703c101e4eb52cd">
   <xsd:schema xmlns:xsd="http://www.w3.org/2001/XMLSchema" xmlns:xs="http://www.w3.org/2001/XMLSchema" xmlns:p="http://schemas.microsoft.com/office/2006/metadata/properties" xmlns:ns2="833209ff-be3b-48c0-8c17-04759cd24c23" xmlns:ns3="1f02373c-91b9-4d50-88b3-64e98dbf38be" targetNamespace="http://schemas.microsoft.com/office/2006/metadata/properties" ma:root="true" ma:fieldsID="2de1db6c7938850308e1daad5469f5c7" ns2:_="" ns3:_="">
     <xsd:import namespace="833209ff-be3b-48c0-8c17-04759cd24c23"/>
@@ -7385,15 +7502,16 @@
 </ct:contentTypeSchema>
 </file>
 
-<file path=customXml/itemProps1.xml><?xml version="1.0" encoding="utf-8"?>
-<ds:datastoreItem xmlns:ds="http://schemas.openxmlformats.org/officeDocument/2006/customXml" ds:itemID="{CE4BE2F9-5067-4088-9F9B-1F3D17ABA8D7}">
-  <ds:schemaRefs>
-    <ds:schemaRef ds:uri="http://schemas.microsoft.com/sharepoint/v3/contenttype/forms"/>
-  </ds:schemaRefs>
-</ds:datastoreItem>
+<file path=customXml/item3.xml><?xml version="1.0" encoding="utf-8"?>
+<?mso-contentType ?>
+<FormTemplates xmlns="http://schemas.microsoft.com/sharepoint/v3/contenttype/forms">
+  <Display>DocumentLibraryForm</Display>
+  <Edit>DocumentLibraryForm</Edit>
+  <New>DocumentLibraryForm</New>
+</FormTemplates>
 </file>
 
-<file path=customXml/itemProps2.xml><?xml version="1.0" encoding="utf-8"?>
+<file path=customXml/itemProps1.xml><?xml version="1.0" encoding="utf-8"?>
 <ds:datastoreItem xmlns:ds="http://schemas.openxmlformats.org/officeDocument/2006/customXml" ds:itemID="{82E5BD80-5074-4316-B334-2041375E4FBF}">
   <ds:schemaRefs>
     <ds:schemaRef ds:uri="http://schemas.microsoft.com/office/2006/metadata/properties"/>
@@ -7404,7 +7522,7 @@
 </ds:datastoreItem>
 </file>
 
-<file path=customXml/itemProps3.xml><?xml version="1.0" encoding="utf-8"?>
+<file path=customXml/itemProps2.xml><?xml version="1.0" encoding="utf-8"?>
 <ds:datastoreItem xmlns:ds="http://schemas.openxmlformats.org/officeDocument/2006/customXml" ds:itemID="{9A75C942-B85E-4058-9186-0955E3756449}">
   <ds:schemaRefs>
     <ds:schemaRef ds:uri="http://schemas.microsoft.com/office/2006/metadata/contentType"/>
@@ -7421,4 +7539,12 @@
     <ds:schemaRef ds:uri="http://schemas.microsoft.com/internal/obd"/>
   </ds:schemaRefs>
 </ds:datastoreItem>
+</file>
+
+<file path=customXml/itemProps3.xml><?xml version="1.0" encoding="utf-8"?>
+<ds:datastoreItem xmlns:ds="http://schemas.openxmlformats.org/officeDocument/2006/customXml" ds:itemID="{CE4BE2F9-5067-4088-9F9B-1F3D17ABA8D7}">
+  <ds:schemaRefs>
+    <ds:schemaRef ds:uri="http://schemas.microsoft.com/sharepoint/v3/contenttype/forms"/>
+  </ds:schemaRefs>
+</ds:datastoreItem>
 </file>
</xml_diff>